<commit_message>
Ajusta plantillas de paquetes de retiro RRLL
</commit_message>
<xml_diff>
--- a/app/templates/rrll/paquete/paquete_retiro_voluntario.docx
+++ b/app/templates/rrll/paquete/paquete_retiro_voluntario.docx
@@ -14,7 +14,7 @@
     </w:p>
     <w:p>
       <w:pPr>
-        <w:spacing w:line="240" w:lineRule="auto" w:after="0"/>
+        <w:spacing w:line="240" w:lineRule="auto"/>
         <w:jc w:val="both"/>
         <w:rPr>
           <w:rFonts w:ascii="Arial Narrow" w:hAnsi="Arial Narrow"/>
@@ -66,7 +66,7 @@
     </w:p>
     <w:p>
       <w:pPr>
-        <w:spacing w:line="240" w:lineRule="auto" w:after="0"/>
+        <w:spacing w:line="240" w:lineRule="auto"/>
         <w:jc w:val="both"/>
         <w:rPr>
           <w:rFonts w:ascii="Arial Narrow" w:hAnsi="Arial Narrow"/>
@@ -85,7 +85,7 @@
     </w:p>
     <w:p>
       <w:pPr>
-        <w:spacing w:line="240" w:lineRule="auto" w:after="0"/>
+        <w:spacing w:line="240" w:lineRule="auto"/>
         <w:jc w:val="both"/>
         <w:rPr>
           <w:rFonts w:ascii="Arial Narrow" w:hAnsi="Arial Narrow"/>
@@ -104,7 +104,7 @@
     </w:p>
     <w:p>
       <w:pPr>
-        <w:spacing w:line="240" w:lineRule="auto" w:after="0"/>
+        <w:spacing w:line="240" w:lineRule="auto"/>
         <w:jc w:val="both"/>
         <w:rPr>
           <w:rFonts w:ascii="Arial Narrow" w:hAnsi="Arial Narrow"/>
@@ -123,7 +123,7 @@
     </w:p>
     <w:p>
       <w:pPr>
-        <w:spacing w:line="240" w:lineRule="auto" w:after="0"/>
+        <w:spacing w:line="240" w:lineRule="auto"/>
         <w:jc w:val="both"/>
         <w:rPr>
           <w:rFonts w:ascii="Arial Narrow" w:hAnsi="Arial Narrow"/>
@@ -153,7 +153,7 @@
     </w:p>
     <w:p>
       <w:pPr>
-        <w:spacing w:line="240" w:lineRule="auto" w:after="0"/>
+        <w:spacing w:line="240" w:lineRule="auto"/>
         <w:jc w:val="right"/>
         <w:rPr>
           <w:rFonts w:ascii="Arial Narrow" w:hAnsi="Arial Narrow"/>
@@ -205,7 +205,7 @@
     </w:p>
     <w:p>
       <w:pPr>
-        <w:spacing w:line="240" w:lineRule="auto" w:after="0"/>
+        <w:spacing w:line="240" w:lineRule="auto"/>
         <w:jc w:val="both"/>
         <w:rPr>
           <w:rFonts w:ascii="Arial Narrow" w:hAnsi="Arial Narrow"/>
@@ -246,7 +246,7 @@
     </w:p>
     <w:p>
       <w:pPr>
-        <w:spacing w:line="240" w:lineRule="auto" w:after="0"/>
+        <w:spacing w:line="240" w:lineRule="auto"/>
         <w:jc w:val="both"/>
         <w:rPr>
           <w:rFonts w:ascii="Arial Narrow" w:hAnsi="Arial Narrow"/>
@@ -276,7 +276,7 @@
     </w:p>
     <w:p>
       <w:pPr>
-        <w:spacing w:before="240" w:line="240" w:lineRule="auto" w:after="0"/>
+        <w:spacing w:before="240"/>
         <w:jc w:val="both"/>
         <w:rPr>
           <w:rFonts w:ascii="Arial Narrow" w:hAnsi="Arial Narrow"/>
@@ -295,7 +295,7 @@
     </w:p>
     <w:p>
       <w:pPr>
-        <w:spacing w:before="240" w:after="0" w:line="240" w:lineRule="auto"/>
+        <w:spacing w:before="240" w:after="240"/>
         <w:ind w:right="-40"/>
         <w:jc w:val="both"/>
         <w:rPr>
@@ -315,7 +315,7 @@
     </w:p>
     <w:p>
       <w:pPr>
-        <w:spacing w:before="240" w:after="0" w:line="240" w:lineRule="auto"/>
+        <w:spacing w:before="240" w:after="240"/>
         <w:ind w:right="280"/>
         <w:jc w:val="both"/>
         <w:rPr>
@@ -346,7 +346,7 @@
     </w:p>
     <w:p>
       <w:pPr>
-        <w:spacing w:line="240" w:lineRule="auto" w:after="0"/>
+        <w:spacing w:line="240" w:lineRule="auto"/>
         <w:jc w:val="both"/>
         <w:rPr>
           <w:rFonts w:ascii="Arial Narrow" w:hAnsi="Arial Narrow"/>
@@ -452,7 +452,7 @@
     </w:p>
     <w:p>
       <w:pPr>
-        <w:spacing w:line="240" w:lineRule="auto" w:after="0"/>
+        <w:spacing w:line="240" w:lineRule="auto"/>
         <w:jc w:val="both"/>
         <w:rPr>
           <w:rFonts w:ascii="Arial Narrow" w:hAnsi="Arial Narrow"/>
@@ -471,7 +471,7 @@
     </w:p>
     <w:p>
       <w:pPr>
-        <w:spacing w:line="240" w:lineRule="auto" w:after="0"/>
+        <w:spacing w:line="240" w:lineRule="auto"/>
         <w:jc w:val="both"/>
         <w:rPr>
           <w:rFonts w:ascii="Arial Narrow" w:hAnsi="Arial Narrow"/>
@@ -490,7 +490,7 @@
     </w:p>
     <w:p>
       <w:pPr>
-        <w:spacing w:line="240" w:lineRule="auto" w:after="0"/>
+        <w:spacing w:line="240" w:lineRule="auto"/>
         <w:jc w:val="both"/>
         <w:rPr>
           <w:b/>
@@ -532,7 +532,7 @@
     </w:p>
     <w:p>
       <w:pPr>
-        <w:spacing w:before="240" w:line="240" w:lineRule="auto" w:after="0"/>
+        <w:spacing w:before="240"/>
         <w:jc w:val="both"/>
         <w:rPr>
           <w:rFonts w:ascii="Arial Narrow" w:hAnsi="Arial Narrow"/>
@@ -581,7 +581,7 @@
     </w:p>
     <w:p>
       <w:pPr>
-        <w:spacing w:line="240" w:lineRule="auto" w:after="0"/>
+        <w:spacing w:line="240" w:lineRule="auto"/>
         <w:jc w:val="both"/>
         <w:rPr>
           <w:rFonts w:ascii="Arial Narrow" w:hAnsi="Arial Narrow"/>
@@ -604,7 +604,7 @@
     </w:p>
     <w:p>
       <w:pPr>
-        <w:spacing w:line="240" w:lineRule="auto" w:after="0"/>
+        <w:spacing w:line="240" w:lineRule="auto"/>
         <w:jc w:val="both"/>
         <w:rPr>
           <w:rFonts w:ascii="Arial Narrow" w:hAnsi="Arial Narrow"/>
@@ -627,7 +627,7 @@
     </w:p>
     <w:p>
       <w:pPr>
-        <w:spacing w:line="240" w:lineRule="auto" w:after="0"/>
+        <w:spacing w:line="240" w:lineRule="auto"/>
         <w:jc w:val="both"/>
         <w:rPr>
           <w:rFonts w:ascii="Arial Narrow" w:hAnsi="Arial Narrow"/>
@@ -650,7 +650,7 @@
     </w:p>
     <w:p>
       <w:pPr>
-        <w:spacing w:line="240" w:lineRule="auto" w:after="0"/>
+        <w:spacing w:line="240" w:lineRule="auto"/>
         <w:jc w:val="both"/>
         <w:rPr>
           <w:rFonts w:ascii="Arial Narrow" w:hAnsi="Arial Narrow"/>
@@ -683,7 +683,7 @@
     </w:p>
     <w:p>
       <w:pPr>
-        <w:spacing w:before="240" w:line="240" w:lineRule="auto" w:after="0"/>
+        <w:spacing w:before="240"/>
         <w:jc w:val="both"/>
         <w:rPr>
           <w:rFonts w:ascii="Arial Narrow" w:hAnsi="Arial Narrow"/>
@@ -697,7 +697,6 @@
           <w:rFonts w:ascii="Arial Narrow" w:hAnsi="Arial Narrow"/>
           <w:b/>
           <w:bCs/>
-          <w:sz w:val="20"/>
         </w:rPr>
         <w:t>REF. :</w:t>
       </w:r>
@@ -707,7 +706,6 @@
           <w:rFonts w:ascii="Arial Narrow" w:hAnsi="Arial Narrow"/>
           <w:b/>
           <w:bCs/>
-          <w:sz w:val="20"/>
         </w:rPr>
         <w:t xml:space="preserve"> EXAMEN MEDICO OCUPACIONAL DE EGRESO</w:t>
       </w:r>
@@ -724,7 +722,7 @@
     </w:p>
     <w:p>
       <w:pPr>
-        <w:spacing w:before="240" w:line="240" w:lineRule="auto" w:after="0"/>
+        <w:spacing w:before="240"/>
         <w:jc w:val="both"/>
         <w:rPr>
           <w:rFonts w:ascii="Arial Narrow" w:hAnsi="Arial Narrow"/>
@@ -788,7 +786,7 @@
     </w:p>
     <w:p>
       <w:pPr>
-        <w:spacing w:before="240" w:line="240" w:lineRule="auto" w:after="0"/>
+        <w:spacing w:before="240"/>
         <w:jc w:val="both"/>
         <w:rPr>
           <w:sz w:val="24"/>
@@ -857,28 +855,9 @@
       </w:r>
       <w:r>
         <w:rPr>
-          <w:rFonts w:ascii="Arial Narrow" w:hAnsi="Arial Narrow" w:eastAsia="Arial Narrow"/>
-          <w:sz w:val="20"/>
-          <w:szCs w:val="24"/>
-        </w:rPr>
-        <w:t xml:space="preserve"> </w:t>
-      </w:r>
-    </w:p>
-    <w:p>
-      <w:pPr>
-        <w:ind w:right="-300"/>
-        <w:jc w:val="both"/>
-        <w:rPr>
           <w:sz w:val="24"/>
           <w:szCs w:val="24"/>
         </w:rPr>
-      </w:pPr>
-      <w:r>
-        <w:rPr>
-          <w:rFonts w:ascii="Arial Narrow" w:hAnsi="Arial Narrow" w:eastAsia="Arial Narrow"/>
-          <w:sz w:val="20"/>
-          <w:szCs w:val="24"/>
-        </w:rPr>
         <w:t xml:space="preserve"> </w:t>
       </w:r>
     </w:p>
@@ -893,22 +872,11 @@
       </w:pPr>
       <w:r>
         <w:rPr>
-          <w:rFonts w:ascii="Arial Narrow" w:hAnsi="Arial Narrow" w:eastAsia="Arial Narrow"/>
-          <w:sz w:val="20"/>
-          <w:szCs w:val="24"/>
-        </w:rPr>
-        <w:t xml:space="preserve"> </w:t>
-      </w:r>
-    </w:p>
-    <w:p>
-      <w:pPr>
-        <w:ind w:right="-300"/>
-        <w:jc w:val="both"/>
-        <w:rPr>
           <w:sz w:val="24"/>
           <w:szCs w:val="24"/>
         </w:rPr>
-      </w:pPr>
+        <w:t xml:space="preserve"> </w:t>
+      </w:r>
     </w:p>
     <w:p>
       <w:pPr>
@@ -919,16 +887,60 @@
           <w:szCs w:val="24"/>
         </w:rPr>
       </w:pPr>
-    </w:p>
-    <w:p>
-      <w:pPr>
-        <w:spacing w:line="240" w:lineRule="auto"/>
-        <w:jc w:val="both"/>
+      <w:r>
         <w:rPr>
           <w:sz w:val="24"/>
           <w:szCs w:val="24"/>
         </w:rPr>
-      </w:pPr>
+        <w:t xml:space="preserve"> </w:t>
+      </w:r>
+    </w:p>
+    <w:p>
+      <w:pPr>
+        <w:ind w:right="-300"/>
+        <w:jc w:val="both"/>
+        <w:rPr>
+          <w:sz w:val="24"/>
+          <w:szCs w:val="24"/>
+        </w:rPr>
+      </w:pPr>
+    </w:p>
+    <w:p>
+      <w:pPr>
+        <w:ind w:right="-300"/>
+        <w:jc w:val="both"/>
+        <w:rPr>
+          <w:sz w:val="24"/>
+          <w:szCs w:val="24"/>
+        </w:rPr>
+      </w:pPr>
+    </w:p>
+    <w:p>
+      <w:pPr>
+        <w:spacing w:line="240" w:lineRule="auto"/>
+        <w:jc w:val="both"/>
+        <w:rPr>
+          <w:sz w:val="24"/>
+          <w:szCs w:val="24"/>
+        </w:rPr>
+      </w:pPr>
+    </w:p>
+    <w:p>
+      <w:pPr>
+        <w:spacing w:line="240" w:lineRule="auto"/>
+        <w:jc w:val="both"/>
+        <w:rPr>
+          <w:sz w:val="24"/>
+          <w:szCs w:val="24"/>
+        </w:rPr>
+      </w:pPr>
+      <w:r>
+        <w:rPr>
+          <w:sz w:val="24"/>
+          <w:szCs w:val="24"/>
+        </w:rPr>
+        <w:t>___________________________________</w:t>
+      </w:r>
     </w:p>
     <w:p>
       <w:pPr>
@@ -984,9 +996,7 @@
     </w:p>
     <w:p>
       <w:pPr>
-        <w:keepNext/>
-        <w:pageBreakBefore/>
-        <w:spacing w:line="240" w:lineRule="auto" w:after="0"/>
+        <w:spacing w:line="192" w:lineRule="auto"/>
         <w:jc w:val="center"/>
         <w:rPr>
           <w:rFonts w:ascii="Arial Narrow" w:hAnsi="Arial Narrow"/>
@@ -1001,7 +1011,7 @@
           <w:rFonts w:ascii="Arial Narrow" w:hAnsi="Arial Narrow"/>
           <w:b/>
           <w:bCs/>
-          <w:sz w:val="20"/>
+          <w:sz w:val="12"/>
           <w:szCs w:val="20"/>
         </w:rPr>
         <w:t>INFORMACIÓN IMPORTANTE</w:t>
@@ -1009,17 +1019,16 @@
     </w:p>
     <w:p>
       <w:pPr>
-        <w:spacing w:line="240" w:lineRule="auto" w:after="0"/>
-        <w:jc w:val="both"/>
-        <w:rPr>
-          <w:sz w:val="16"/>
-          <w:szCs w:val="16"/>
-        </w:rPr>
-      </w:pPr>
-      <w:r>
-        <w:rPr>
-          <w:rFonts w:ascii="Arial Narrow" w:hAnsi="Arial Narrow" w:eastAsia="Arial Narrow"/>
-          <w:sz w:val="20"/>
+        <w:spacing w:line="192" w:lineRule="auto"/>
+        <w:jc w:val="both"/>
+        <w:rPr>
+          <w:sz w:val="16"/>
+          <w:szCs w:val="16"/>
+        </w:rPr>
+      </w:pPr>
+      <w:r>
+        <w:rPr>
+          <w:sz w:val="12"/>
           <w:szCs w:val="16"/>
         </w:rPr>
         <w:t>En Colombia existen mecanismos de protección al trabajador para cuando este queda desempleado; entre ellos y principalmente:</w:t>
@@ -1027,17 +1036,16 @@
     </w:p>
     <w:p>
       <w:pPr>
-        <w:spacing w:line="240" w:lineRule="auto" w:after="0"/>
-        <w:jc w:val="both"/>
-        <w:rPr>
-          <w:sz w:val="16"/>
-          <w:szCs w:val="16"/>
-        </w:rPr>
-      </w:pPr>
-      <w:r>
-        <w:rPr>
-          <w:rFonts w:ascii="Arial Narrow" w:hAnsi="Arial Narrow" w:eastAsia="Arial Narrow"/>
-          <w:sz w:val="20"/>
+        <w:spacing w:line="192" w:lineRule="auto"/>
+        <w:jc w:val="both"/>
+        <w:rPr>
+          <w:sz w:val="16"/>
+          <w:szCs w:val="16"/>
+        </w:rPr>
+      </w:pPr>
+      <w:r>
+        <w:rPr>
+          <w:sz w:val="12"/>
           <w:szCs w:val="16"/>
         </w:rPr>
         <w:t>a) Subsidios</w:t>
@@ -1045,17 +1053,16 @@
     </w:p>
     <w:p>
       <w:pPr>
-        <w:spacing w:line="240" w:lineRule="auto" w:after="0"/>
-        <w:jc w:val="both"/>
-        <w:rPr>
-          <w:sz w:val="16"/>
-          <w:szCs w:val="16"/>
-        </w:rPr>
-      </w:pPr>
-      <w:r>
-        <w:rPr>
-          <w:rFonts w:ascii="Arial Narrow" w:hAnsi="Arial Narrow" w:eastAsia="Arial Narrow"/>
-          <w:sz w:val="20"/>
+        <w:spacing w:line="192" w:lineRule="auto"/>
+        <w:jc w:val="both"/>
+        <w:rPr>
+          <w:sz w:val="16"/>
+          <w:szCs w:val="16"/>
+        </w:rPr>
+      </w:pPr>
+      <w:r>
+        <w:rPr>
+          <w:sz w:val="12"/>
           <w:szCs w:val="16"/>
         </w:rPr>
         <w:t>b) Capacitación laboral</w:t>
@@ -1063,17 +1070,16 @@
     </w:p>
     <w:p>
       <w:pPr>
-        <w:spacing w:line="240" w:lineRule="auto" w:after="0"/>
-        <w:jc w:val="both"/>
-        <w:rPr>
-          <w:sz w:val="16"/>
-          <w:szCs w:val="16"/>
-        </w:rPr>
-      </w:pPr>
-      <w:r>
-        <w:rPr>
-          <w:rFonts w:ascii="Arial Narrow" w:hAnsi="Arial Narrow" w:eastAsia="Arial Narrow"/>
-          <w:sz w:val="20"/>
+        <w:spacing w:line="192" w:lineRule="auto"/>
+        <w:jc w:val="both"/>
+        <w:rPr>
+          <w:sz w:val="16"/>
+          <w:szCs w:val="16"/>
+        </w:rPr>
+      </w:pPr>
+      <w:r>
+        <w:rPr>
+          <w:sz w:val="12"/>
           <w:szCs w:val="16"/>
         </w:rPr>
         <w:t>c) Acceso a portales efectivos de búsqueda de empleo</w:t>
@@ -1081,17 +1087,16 @@
     </w:p>
     <w:p>
       <w:pPr>
-        <w:spacing w:line="240" w:lineRule="auto" w:after="0"/>
-        <w:jc w:val="both"/>
-        <w:rPr>
-          <w:sz w:val="16"/>
-          <w:szCs w:val="16"/>
-        </w:rPr>
-      </w:pPr>
-      <w:r>
-        <w:rPr>
-          <w:rFonts w:ascii="Arial Narrow" w:hAnsi="Arial Narrow" w:eastAsia="Arial Narrow"/>
-          <w:sz w:val="20"/>
+        <w:spacing w:line="192" w:lineRule="auto"/>
+        <w:jc w:val="both"/>
+        <w:rPr>
+          <w:sz w:val="16"/>
+          <w:szCs w:val="16"/>
+        </w:rPr>
+      </w:pPr>
+      <w:r>
+        <w:rPr>
+          <w:sz w:val="12"/>
           <w:szCs w:val="16"/>
         </w:rPr>
         <w:t>d) Continuidad hasta por seis (6) meses en Seguridad Social (aportes a pensión y salud) y parafiscales (Subsidio Familiar)</w:t>
@@ -1109,19 +1114,16 @@
     </w:p>
     <w:p>
       <w:pPr>
-        <w:keepNext/>
-        <w:spacing w:line="240" w:lineRule="auto" w:after="0"/>
-        <w:jc w:val="both"/>
-        <w:rPr>
-          <w:sz w:val="16"/>
-          <w:szCs w:val="16"/>
-        </w:rPr>
-      </w:pPr>
-      <w:r>
-        <w:rPr>
-          <w:rFonts w:ascii="Arial Narrow" w:hAnsi="Arial Narrow" w:eastAsia="Arial Narrow"/>
-          <w:b/>
-          <w:sz w:val="20"/>
+        <w:spacing w:line="192" w:lineRule="auto"/>
+        <w:jc w:val="both"/>
+        <w:rPr>
+          <w:sz w:val="16"/>
+          <w:szCs w:val="16"/>
+        </w:rPr>
+      </w:pPr>
+      <w:r>
+        <w:rPr>
+          <w:sz w:val="12"/>
           <w:szCs w:val="16"/>
         </w:rPr>
         <w:t>¿Qué es el Mecanismo de Protección al Cesante MPC?</w:t>
@@ -1129,17 +1131,16 @@
     </w:p>
     <w:p>
       <w:pPr>
-        <w:spacing w:line="240" w:lineRule="auto" w:after="0"/>
-        <w:jc w:val="both"/>
-        <w:rPr>
-          <w:sz w:val="16"/>
-          <w:szCs w:val="16"/>
-        </w:rPr>
-      </w:pPr>
-      <w:r>
-        <w:rPr>
-          <w:rFonts w:ascii="Arial Narrow" w:hAnsi="Arial Narrow" w:eastAsia="Arial Narrow"/>
-          <w:sz w:val="20"/>
+        <w:spacing w:line="192" w:lineRule="auto"/>
+        <w:jc w:val="both"/>
+        <w:rPr>
+          <w:sz w:val="16"/>
+          <w:szCs w:val="16"/>
+        </w:rPr>
+      </w:pPr>
+      <w:r>
+        <w:rPr>
+          <w:sz w:val="12"/>
           <w:szCs w:val="16"/>
         </w:rPr>
         <w:t>Es un mecanismo que garantiza la protección social de los trabajadores en caso de quedar desempleados, manteniendo el acceso a salud, el ahorro a pensiones, su subsidio familiar y el acceso a servicios de intermediación con el objetivo de ubicarse de nuevo laboralmente en el menor tiempo posible, además de capacitación laboral. A través de este mecanismo se integran, además de los beneficios monetarios, los servicios de intermediación laboral y la capacitación brindada por el SENA y las Cajas de Compensación Familiar.</w:t>
@@ -1157,19 +1158,16 @@
     </w:p>
     <w:p>
       <w:pPr>
-        <w:keepNext/>
-        <w:spacing w:line="240" w:lineRule="auto" w:after="0"/>
-        <w:jc w:val="both"/>
-        <w:rPr>
-          <w:sz w:val="16"/>
-          <w:szCs w:val="16"/>
-        </w:rPr>
-      </w:pPr>
-      <w:r>
-        <w:rPr>
-          <w:rFonts w:ascii="Arial Narrow" w:hAnsi="Arial Narrow" w:eastAsia="Arial Narrow"/>
-          <w:b/>
-          <w:sz w:val="20"/>
+        <w:spacing w:line="192" w:lineRule="auto"/>
+        <w:jc w:val="both"/>
+        <w:rPr>
+          <w:sz w:val="16"/>
+          <w:szCs w:val="16"/>
+        </w:rPr>
+      </w:pPr>
+      <w:r>
+        <w:rPr>
+          <w:sz w:val="12"/>
           <w:szCs w:val="16"/>
         </w:rPr>
         <w:lastRenderedPageBreak/>
@@ -1178,17 +1176,16 @@
     </w:p>
     <w:p>
       <w:pPr>
-        <w:spacing w:line="240" w:lineRule="auto" w:after="0"/>
-        <w:jc w:val="both"/>
-        <w:rPr>
-          <w:sz w:val="16"/>
-          <w:szCs w:val="16"/>
-        </w:rPr>
-      </w:pPr>
-      <w:r>
-        <w:rPr>
-          <w:rFonts w:ascii="Arial Narrow" w:hAnsi="Arial Narrow" w:eastAsia="Arial Narrow"/>
-          <w:sz w:val="20"/>
+        <w:spacing w:line="192" w:lineRule="auto"/>
+        <w:jc w:val="both"/>
+        <w:rPr>
+          <w:sz w:val="16"/>
+          <w:szCs w:val="16"/>
+        </w:rPr>
+      </w:pPr>
+      <w:r>
+        <w:rPr>
+          <w:sz w:val="12"/>
           <w:szCs w:val="16"/>
         </w:rPr>
         <w:t>Todos los trabajadores que hayan realizado aportes a las Cajas de Compensación Familiar durante al menos un año, continuo o discontinuo, en el transcurso de los últimos tres años.</w:t>
@@ -1206,19 +1203,16 @@
     </w:p>
     <w:p>
       <w:pPr>
-        <w:keepNext/>
-        <w:spacing w:line="240" w:lineRule="auto" w:after="0"/>
-        <w:jc w:val="both"/>
-        <w:rPr>
-          <w:sz w:val="16"/>
-          <w:szCs w:val="16"/>
-        </w:rPr>
-      </w:pPr>
-      <w:r>
-        <w:rPr>
-          <w:rFonts w:ascii="Arial Narrow" w:hAnsi="Arial Narrow" w:eastAsia="Arial Narrow"/>
-          <w:b/>
-          <w:sz w:val="20"/>
+        <w:spacing w:line="192" w:lineRule="auto"/>
+        <w:jc w:val="both"/>
+        <w:rPr>
+          <w:sz w:val="16"/>
+          <w:szCs w:val="16"/>
+        </w:rPr>
+      </w:pPr>
+      <w:r>
+        <w:rPr>
+          <w:sz w:val="12"/>
           <w:szCs w:val="16"/>
         </w:rPr>
         <w:t>Cuánto tiempo tengo de salud después de terminado mi contrato de trabajo, en caso que no pueda acceder al Mecanismo de Protección al Cesante?</w:t>
@@ -1226,17 +1220,16 @@
     </w:p>
     <w:p>
       <w:pPr>
-        <w:spacing w:line="240" w:lineRule="auto" w:after="0"/>
-        <w:jc w:val="both"/>
-        <w:rPr>
-          <w:sz w:val="16"/>
-          <w:szCs w:val="16"/>
-        </w:rPr>
-      </w:pPr>
-      <w:r>
-        <w:rPr>
-          <w:rFonts w:ascii="Arial Narrow" w:hAnsi="Arial Narrow" w:eastAsia="Arial Narrow"/>
-          <w:sz w:val="20"/>
+        <w:spacing w:line="192" w:lineRule="auto"/>
+        <w:jc w:val="both"/>
+        <w:rPr>
+          <w:sz w:val="16"/>
+          <w:szCs w:val="16"/>
+        </w:rPr>
+      </w:pPr>
+      <w:r>
+        <w:rPr>
+          <w:sz w:val="12"/>
           <w:szCs w:val="16"/>
         </w:rPr>
         <w:t>El trabajador puede acceder a Cobertura de servicios y período de protección laboral donde el trabajador y su núcleo familiar gozarán de los beneficios del plan obligatorio de salud en aquellas enfermedades que venían en tratamiento o aquellas derivadas de una urgencia: hasta por treinta (30) días más contados desde la desafiliación, siempre y cuando haya estado afiliado al sistema como mínimo los doce meses anteriores. hasta tres (3) meses más contados desde la desafiliación, siempre y cuando lleve cinco (5) años o más de afiliación continua a una misma Entidad Promotora de Salud</w:t>
@@ -1254,19 +1247,16 @@
     </w:p>
     <w:p>
       <w:pPr>
-        <w:keepNext/>
-        <w:spacing w:line="240" w:lineRule="auto" w:after="0"/>
-        <w:jc w:val="both"/>
-        <w:rPr>
-          <w:sz w:val="16"/>
-          <w:szCs w:val="16"/>
-        </w:rPr>
-      </w:pPr>
-      <w:r>
-        <w:rPr>
-          <w:rFonts w:ascii="Arial Narrow" w:hAnsi="Arial Narrow" w:eastAsia="Arial Narrow"/>
-          <w:b/>
-          <w:sz w:val="20"/>
+        <w:spacing w:line="192" w:lineRule="auto"/>
+        <w:jc w:val="both"/>
+        <w:rPr>
+          <w:sz w:val="16"/>
+          <w:szCs w:val="16"/>
+        </w:rPr>
+      </w:pPr>
+      <w:r>
+        <w:rPr>
+          <w:sz w:val="12"/>
           <w:szCs w:val="16"/>
         </w:rPr>
         <w:t>¿Qué pasa con las Cesantías?</w:t>
@@ -1274,17 +1264,16 @@
     </w:p>
     <w:p>
       <w:pPr>
-        <w:spacing w:line="240" w:lineRule="auto" w:after="0"/>
-        <w:jc w:val="both"/>
-        <w:rPr>
-          <w:sz w:val="16"/>
-          <w:szCs w:val="16"/>
-        </w:rPr>
-      </w:pPr>
-      <w:r>
-        <w:rPr>
-          <w:rFonts w:ascii="Arial Narrow" w:hAnsi="Arial Narrow" w:eastAsia="Arial Narrow"/>
-          <w:sz w:val="20"/>
+        <w:spacing w:line="192" w:lineRule="auto"/>
+        <w:jc w:val="both"/>
+        <w:rPr>
+          <w:sz w:val="16"/>
+          <w:szCs w:val="16"/>
+        </w:rPr>
+      </w:pPr>
+      <w:r>
+        <w:rPr>
+          <w:sz w:val="12"/>
           <w:szCs w:val="16"/>
         </w:rPr>
         <w:t>Estas son entregadas al Trabajador en el momento de finalizar el contrato (tanto las depositadas en el Fondo como las causadas en la empresa, salvo hayan sido comprometidas en pagos de créditos) por esta razón la importancia de no haberlas gastado y utilizado mientras se encuentra vigente el contrato de trabajo</w:t>
@@ -1302,19 +1291,16 @@
     </w:p>
     <w:p>
       <w:pPr>
-        <w:keepNext/>
-        <w:spacing w:line="240" w:lineRule="auto" w:after="0"/>
-        <w:jc w:val="both"/>
-        <w:rPr>
-          <w:sz w:val="16"/>
-          <w:szCs w:val="16"/>
-        </w:rPr>
-      </w:pPr>
-      <w:r>
-        <w:rPr>
-          <w:rFonts w:ascii="Arial Narrow" w:hAnsi="Arial Narrow" w:eastAsia="Arial Narrow"/>
-          <w:b/>
-          <w:sz w:val="20"/>
+        <w:spacing w:line="192" w:lineRule="auto"/>
+        <w:jc w:val="both"/>
+        <w:rPr>
+          <w:sz w:val="16"/>
+          <w:szCs w:val="16"/>
+        </w:rPr>
+      </w:pPr>
+      <w:r>
+        <w:rPr>
+          <w:sz w:val="12"/>
           <w:szCs w:val="16"/>
         </w:rPr>
         <w:t>¿Qué beneficio puedo obtener de ahorrar parte de mis cesantías en el Mecanismo de Protección al Cesante?</w:t>
@@ -1322,17 +1308,16 @@
     </w:p>
     <w:p>
       <w:pPr>
-        <w:spacing w:line="240" w:lineRule="auto" w:after="0"/>
-        <w:jc w:val="both"/>
-        <w:rPr>
-          <w:sz w:val="16"/>
-          <w:szCs w:val="16"/>
-        </w:rPr>
-      </w:pPr>
-      <w:r>
-        <w:rPr>
-          <w:rFonts w:ascii="Arial Narrow" w:hAnsi="Arial Narrow" w:eastAsia="Arial Narrow"/>
-          <w:sz w:val="20"/>
+        <w:spacing w:line="192" w:lineRule="auto"/>
+        <w:jc w:val="both"/>
+        <w:rPr>
+          <w:sz w:val="16"/>
+          <w:szCs w:val="16"/>
+        </w:rPr>
+      </w:pPr>
+      <w:r>
+        <w:rPr>
+          <w:sz w:val="12"/>
           <w:szCs w:val="16"/>
         </w:rPr>
         <w:t>Los trabajadores dependientes o independientes que hayan ahorrado voluntariamente para el Mecanismo de Protección Cesante recibirán un beneficio monetario proporcional a su ahorro que se hará efectivo con cargo al FOSFEC en el momento en que quede cesante.</w:t>
@@ -1350,19 +1335,16 @@
     </w:p>
     <w:p>
       <w:pPr>
-        <w:keepNext/>
-        <w:spacing w:line="240" w:lineRule="auto" w:after="0"/>
-        <w:jc w:val="both"/>
-        <w:rPr>
-          <w:sz w:val="16"/>
-          <w:szCs w:val="16"/>
-        </w:rPr>
-      </w:pPr>
-      <w:r>
-        <w:rPr>
-          <w:rFonts w:ascii="Arial Narrow" w:hAnsi="Arial Narrow" w:eastAsia="Arial Narrow"/>
-          <w:b/>
-          <w:sz w:val="20"/>
+        <w:spacing w:line="192" w:lineRule="auto"/>
+        <w:jc w:val="both"/>
+        <w:rPr>
+          <w:sz w:val="16"/>
+          <w:szCs w:val="16"/>
+        </w:rPr>
+      </w:pPr>
+      <w:r>
+        <w:rPr>
+          <w:sz w:val="12"/>
           <w:szCs w:val="16"/>
         </w:rPr>
         <w:t>¿Puedo acceder al seguro de desempleo?</w:t>
@@ -1370,17 +1352,16 @@
     </w:p>
     <w:p>
       <w:pPr>
-        <w:spacing w:line="240" w:lineRule="auto" w:after="0"/>
-        <w:jc w:val="both"/>
-        <w:rPr>
-          <w:sz w:val="16"/>
-          <w:szCs w:val="16"/>
-        </w:rPr>
-      </w:pPr>
-      <w:r>
-        <w:rPr>
-          <w:rFonts w:ascii="Arial Narrow" w:hAnsi="Arial Narrow" w:eastAsia="Arial Narrow"/>
-          <w:sz w:val="20"/>
+        <w:spacing w:line="192" w:lineRule="auto"/>
+        <w:jc w:val="both"/>
+        <w:rPr>
+          <w:sz w:val="16"/>
+          <w:szCs w:val="16"/>
+        </w:rPr>
+      </w:pPr>
+      <w:r>
+        <w:rPr>
+          <w:sz w:val="12"/>
           <w:szCs w:val="16"/>
         </w:rPr>
         <w:t>Tiene derecho a cobrar un auxilio que el Gobierno le da por $172.364 mensuales (vigencia 2016) y por un periodo de seis meses. Una protección a la que se le suman los aportes a salud y pensión, pago de cuota monetaria y el incentivo por ahorro de cesantías. El trámite de inscripción lo debe hacer en una caja de compensación familiar.</w:t>
@@ -1398,19 +1379,16 @@
     </w:p>
     <w:p>
       <w:pPr>
-        <w:keepNext/>
-        <w:spacing w:line="240" w:lineRule="auto" w:after="0"/>
-        <w:jc w:val="both"/>
-        <w:rPr>
-          <w:sz w:val="16"/>
-          <w:szCs w:val="16"/>
-        </w:rPr>
-      </w:pPr>
-      <w:r>
-        <w:rPr>
-          <w:rFonts w:ascii="Arial Narrow" w:hAnsi="Arial Narrow" w:eastAsia="Arial Narrow"/>
-          <w:b/>
-          <w:sz w:val="20"/>
+        <w:spacing w:line="192" w:lineRule="auto"/>
+        <w:jc w:val="both"/>
+        <w:rPr>
+          <w:sz w:val="16"/>
+          <w:szCs w:val="16"/>
+        </w:rPr>
+      </w:pPr>
+      <w:r>
+        <w:rPr>
+          <w:sz w:val="12"/>
           <w:szCs w:val="16"/>
         </w:rPr>
         <w:t>¿Puedo seguir usando mis cesantías para educación, compra, construcción o mejoras de vivienda?</w:t>
@@ -1418,17 +1396,16 @@
     </w:p>
     <w:p>
       <w:pPr>
-        <w:spacing w:line="240" w:lineRule="auto" w:after="0"/>
-        <w:jc w:val="both"/>
-        <w:rPr>
-          <w:sz w:val="16"/>
-          <w:szCs w:val="16"/>
-        </w:rPr>
-      </w:pPr>
-      <w:r>
-        <w:rPr>
-          <w:rFonts w:ascii="Arial Narrow" w:hAnsi="Arial Narrow" w:eastAsia="Arial Narrow"/>
-          <w:sz w:val="20"/>
+        <w:spacing w:line="192" w:lineRule="auto"/>
+        <w:jc w:val="both"/>
+        <w:rPr>
+          <w:sz w:val="16"/>
+          <w:szCs w:val="16"/>
+        </w:rPr>
+      </w:pPr>
+      <w:r>
+        <w:rPr>
+          <w:sz w:val="12"/>
           <w:szCs w:val="16"/>
         </w:rPr>
         <w:t>El trabajador que quiera usar las cesantías para educación, compra, construcción o mejoras de vivienda podrá usarla para este efecto el 100% de sus cesantías sin problema alguno.</w:t>
@@ -1446,19 +1423,16 @@
     </w:p>
     <w:p>
       <w:pPr>
-        <w:keepNext/>
-        <w:spacing w:line="240" w:lineRule="auto" w:after="0"/>
-        <w:jc w:val="both"/>
-        <w:rPr>
-          <w:sz w:val="16"/>
-          <w:szCs w:val="16"/>
-        </w:rPr>
-      </w:pPr>
-      <w:r>
-        <w:rPr>
-          <w:rFonts w:ascii="Arial Narrow" w:hAnsi="Arial Narrow" w:eastAsia="Arial Narrow"/>
-          <w:b/>
-          <w:sz w:val="20"/>
+        <w:spacing w:line="192" w:lineRule="auto"/>
+        <w:jc w:val="both"/>
+        <w:rPr>
+          <w:sz w:val="16"/>
+          <w:szCs w:val="16"/>
+        </w:rPr>
+      </w:pPr>
+      <w:r>
+        <w:rPr>
+          <w:sz w:val="12"/>
           <w:szCs w:val="16"/>
         </w:rPr>
         <w:t>¿Qué requisitos se necesitan para acceder a los beneficios ofrecidos por el Mecanismo de Protección al Cesante?</w:t>
@@ -1466,17 +1440,16 @@
     </w:p>
     <w:p>
       <w:pPr>
-        <w:spacing w:line="240" w:lineRule="auto" w:after="0"/>
-        <w:jc w:val="both"/>
-        <w:rPr>
-          <w:sz w:val="16"/>
-          <w:szCs w:val="16"/>
-        </w:rPr>
-      </w:pPr>
-      <w:r>
-        <w:rPr>
-          <w:rFonts w:ascii="Arial Narrow" w:hAnsi="Arial Narrow" w:eastAsia="Arial Narrow"/>
-          <w:sz w:val="20"/>
+        <w:spacing w:line="192" w:lineRule="auto"/>
+        <w:jc w:val="both"/>
+        <w:rPr>
+          <w:sz w:val="16"/>
+          <w:szCs w:val="16"/>
+        </w:rPr>
+      </w:pPr>
+      <w:r>
+        <w:rPr>
+          <w:sz w:val="12"/>
           <w:szCs w:val="16"/>
         </w:rPr>
         <w:t>1. Que su situación laboral haya terminado por cualquier causa.</w:t>
@@ -1484,17 +1457,16 @@
     </w:p>
     <w:p>
       <w:pPr>
-        <w:spacing w:line="240" w:lineRule="auto" w:after="0"/>
-        <w:jc w:val="both"/>
-        <w:rPr>
-          <w:sz w:val="16"/>
-          <w:szCs w:val="16"/>
-        </w:rPr>
-      </w:pPr>
-      <w:r>
-        <w:rPr>
-          <w:rFonts w:ascii="Arial Narrow" w:hAnsi="Arial Narrow" w:eastAsia="Arial Narrow"/>
-          <w:sz w:val="20"/>
+        <w:spacing w:line="192" w:lineRule="auto"/>
+        <w:jc w:val="both"/>
+        <w:rPr>
+          <w:sz w:val="16"/>
+          <w:szCs w:val="16"/>
+        </w:rPr>
+      </w:pPr>
+      <w:r>
+        <w:rPr>
+          <w:sz w:val="12"/>
           <w:szCs w:val="16"/>
         </w:rPr>
         <w:t>2. Que hayan realizado aportes durante un año, continuo o discontinuo, a una Caja de Compensación Familiar en el transcurso de los últimos tres años.</w:t>
@@ -1502,17 +1474,16 @@
     </w:p>
     <w:p>
       <w:pPr>
-        <w:spacing w:line="240" w:lineRule="auto" w:after="0"/>
-        <w:jc w:val="both"/>
-        <w:rPr>
-          <w:sz w:val="16"/>
-          <w:szCs w:val="16"/>
-        </w:rPr>
-      </w:pPr>
-      <w:r>
-        <w:rPr>
-          <w:rFonts w:ascii="Arial Narrow" w:hAnsi="Arial Narrow" w:eastAsia="Arial Narrow"/>
-          <w:sz w:val="20"/>
+        <w:spacing w:line="192" w:lineRule="auto"/>
+        <w:jc w:val="both"/>
+        <w:rPr>
+          <w:sz w:val="16"/>
+          <w:szCs w:val="16"/>
+        </w:rPr>
+      </w:pPr>
+      <w:r>
+        <w:rPr>
+          <w:sz w:val="12"/>
           <w:szCs w:val="16"/>
         </w:rPr>
         <w:t>3. Inscribirse en cualquiera de los servicios de empleo autorizados pertenecientes a la Red de Servicios de Empleo y desarrollar la ruta hacia la búsqueda de empleo.</w:t>
@@ -1520,17 +1491,16 @@
     </w:p>
     <w:p>
       <w:pPr>
-        <w:spacing w:line="240" w:lineRule="auto" w:after="0"/>
-        <w:jc w:val="both"/>
-        <w:rPr>
-          <w:sz w:val="16"/>
-          <w:szCs w:val="16"/>
-        </w:rPr>
-      </w:pPr>
-      <w:r>
-        <w:rPr>
-          <w:rFonts w:ascii="Arial Narrow" w:hAnsi="Arial Narrow" w:eastAsia="Arial Narrow"/>
-          <w:sz w:val="20"/>
+        <w:spacing w:line="192" w:lineRule="auto"/>
+        <w:jc w:val="both"/>
+        <w:rPr>
+          <w:sz w:val="16"/>
+          <w:szCs w:val="16"/>
+        </w:rPr>
+      </w:pPr>
+      <w:r>
+        <w:rPr>
+          <w:sz w:val="12"/>
           <w:szCs w:val="16"/>
         </w:rPr>
         <w:t xml:space="preserve">4. Estar inscrito en programas de capacitación y </w:t>
@@ -1538,8 +1508,7 @@
       <w:proofErr w:type="spellStart"/>
       <w:r>
         <w:rPr>
-          <w:rFonts w:ascii="Arial Narrow" w:hAnsi="Arial Narrow" w:eastAsia="Arial Narrow"/>
-          <w:sz w:val="20"/>
+          <w:sz w:val="12"/>
           <w:szCs w:val="16"/>
         </w:rPr>
         <w:t>re-entrenamiento</w:t>
@@ -1547,8 +1516,7 @@
       <w:proofErr w:type="spellEnd"/>
       <w:r>
         <w:rPr>
-          <w:rFonts w:ascii="Arial Narrow" w:hAnsi="Arial Narrow" w:eastAsia="Arial Narrow"/>
-          <w:sz w:val="20"/>
+          <w:sz w:val="12"/>
           <w:szCs w:val="16"/>
         </w:rPr>
         <w:t xml:space="preserve"> en los términos dispuestos por la reglamentación que expida el Gobierno Nacional.</w:t>
@@ -1556,17 +1524,16 @@
     </w:p>
     <w:p>
       <w:pPr>
-        <w:spacing w:line="240" w:lineRule="auto" w:after="0"/>
-        <w:jc w:val="both"/>
-        <w:rPr>
-          <w:sz w:val="16"/>
-          <w:szCs w:val="16"/>
-        </w:rPr>
-      </w:pPr>
-      <w:r>
-        <w:rPr>
-          <w:rFonts w:ascii="Arial Narrow" w:hAnsi="Arial Narrow" w:eastAsia="Arial Narrow"/>
-          <w:sz w:val="20"/>
+        <w:spacing w:line="192" w:lineRule="auto"/>
+        <w:jc w:val="both"/>
+        <w:rPr>
+          <w:sz w:val="16"/>
+          <w:szCs w:val="16"/>
+        </w:rPr>
+      </w:pPr>
+      <w:r>
+        <w:rPr>
+          <w:sz w:val="12"/>
           <w:szCs w:val="16"/>
         </w:rPr>
         <w:t>5. Para tener derecho al incentivo monetario por el ahorro voluntario de sus cesantías, quienes devenguen hasta dos SMMLV deberán haber ahorrado como mínimo el 10% del promedio de su salario mensual del último año. Para quienes devenguen más de 2 SMMLV el ahorro mínimo deberá ser de 25%.</w:t>
@@ -1584,19 +1551,16 @@
     </w:p>
     <w:p>
       <w:pPr>
-        <w:keepNext/>
-        <w:spacing w:line="240" w:lineRule="auto" w:after="0"/>
-        <w:jc w:val="both"/>
-        <w:rPr>
-          <w:sz w:val="16"/>
-          <w:szCs w:val="16"/>
-        </w:rPr>
-      </w:pPr>
-      <w:r>
-        <w:rPr>
-          <w:rFonts w:ascii="Arial Narrow" w:hAnsi="Arial Narrow" w:eastAsia="Arial Narrow"/>
-          <w:b/>
-          <w:sz w:val="20"/>
+        <w:spacing w:line="192" w:lineRule="auto"/>
+        <w:jc w:val="both"/>
+        <w:rPr>
+          <w:sz w:val="16"/>
+          <w:szCs w:val="16"/>
+        </w:rPr>
+      </w:pPr>
+      <w:r>
+        <w:rPr>
+          <w:sz w:val="12"/>
           <w:szCs w:val="16"/>
         </w:rPr>
         <w:t>¿Qué me exigen para conservar los beneficios del Mecanismo de Protección al Cesante?</w:t>
@@ -1604,17 +1568,16 @@
     </w:p>
     <w:p>
       <w:pPr>
-        <w:spacing w:line="240" w:lineRule="auto" w:after="0"/>
-        <w:jc w:val="both"/>
-        <w:rPr>
-          <w:sz w:val="16"/>
-          <w:szCs w:val="16"/>
-        </w:rPr>
-      </w:pPr>
-      <w:r>
-        <w:rPr>
-          <w:rFonts w:ascii="Arial Narrow" w:hAnsi="Arial Narrow" w:eastAsia="Arial Narrow"/>
-          <w:sz w:val="20"/>
+        <w:spacing w:line="192" w:lineRule="auto"/>
+        <w:jc w:val="both"/>
+        <w:rPr>
+          <w:sz w:val="16"/>
+          <w:szCs w:val="16"/>
+        </w:rPr>
+      </w:pPr>
+      <w:r>
+        <w:rPr>
+          <w:sz w:val="12"/>
           <w:szCs w:val="16"/>
         </w:rPr>
         <w:t>1. Acudir a los servicios de colocación ofrecidos por el Servicio Público de Empleo.</w:t>
@@ -1622,17 +1585,16 @@
     </w:p>
     <w:p>
       <w:pPr>
-        <w:spacing w:line="240" w:lineRule="auto" w:after="0"/>
-        <w:jc w:val="both"/>
-        <w:rPr>
-          <w:sz w:val="16"/>
-          <w:szCs w:val="16"/>
-        </w:rPr>
-      </w:pPr>
-      <w:r>
-        <w:rPr>
-          <w:rFonts w:ascii="Arial Narrow" w:hAnsi="Arial Narrow" w:eastAsia="Arial Narrow"/>
-          <w:sz w:val="20"/>
+        <w:spacing w:line="192" w:lineRule="auto"/>
+        <w:jc w:val="both"/>
+        <w:rPr>
+          <w:sz w:val="16"/>
+          <w:szCs w:val="16"/>
+        </w:rPr>
+      </w:pPr>
+      <w:r>
+        <w:rPr>
+          <w:sz w:val="12"/>
           <w:szCs w:val="16"/>
         </w:rPr>
         <w:t>2. Cumplir con los trámites exigidos por el Servicio Público de Empleo y los requisitos para participar en el proceso de selección de los empleadores a los que sea remitido por este.</w:t>
@@ -1640,17 +1602,16 @@
     </w:p>
     <w:p>
       <w:pPr>
-        <w:spacing w:line="240" w:lineRule="auto" w:after="0"/>
-        <w:jc w:val="both"/>
-        <w:rPr>
-          <w:sz w:val="16"/>
-          <w:szCs w:val="16"/>
-        </w:rPr>
-      </w:pPr>
-      <w:r>
-        <w:rPr>
-          <w:rFonts w:ascii="Arial Narrow" w:hAnsi="Arial Narrow" w:eastAsia="Arial Narrow"/>
-          <w:sz w:val="20"/>
+        <w:spacing w:line="192" w:lineRule="auto"/>
+        <w:jc w:val="both"/>
+        <w:rPr>
+          <w:sz w:val="16"/>
+          <w:szCs w:val="16"/>
+        </w:rPr>
+      </w:pPr>
+      <w:r>
+        <w:rPr>
+          <w:sz w:val="12"/>
           <w:szCs w:val="16"/>
         </w:rPr>
         <w:t>3. No rechazar la ocupación que le ofrezca el Servicio Público de Empleo</w:t>
@@ -1658,17 +1619,16 @@
     </w:p>
     <w:p>
       <w:pPr>
-        <w:spacing w:line="240" w:lineRule="auto" w:after="0"/>
-        <w:jc w:val="both"/>
-        <w:rPr>
-          <w:sz w:val="16"/>
-          <w:szCs w:val="16"/>
-        </w:rPr>
-      </w:pPr>
-      <w:r>
-        <w:rPr>
-          <w:rFonts w:ascii="Arial Narrow" w:hAnsi="Arial Narrow" w:eastAsia="Arial Narrow"/>
-          <w:sz w:val="20"/>
+        <w:spacing w:line="192" w:lineRule="auto"/>
+        <w:jc w:val="both"/>
+        <w:rPr>
+          <w:sz w:val="16"/>
+          <w:szCs w:val="16"/>
+        </w:rPr>
+      </w:pPr>
+      <w:r>
+        <w:rPr>
+          <w:sz w:val="12"/>
           <w:szCs w:val="16"/>
         </w:rPr>
         <w:t>4. Culminar el proceso de formación al cual se haya inscrito para adecuar sus competencias básicas y laborales específicas, excepto en casos de fuerza mayor que reglamentará el Gobierno Nacional.</w:t>
@@ -1686,19 +1646,16 @@
     </w:p>
     <w:p>
       <w:pPr>
-        <w:keepNext/>
-        <w:spacing w:line="240" w:lineRule="auto" w:after="0"/>
-        <w:jc w:val="both"/>
-        <w:rPr>
-          <w:sz w:val="16"/>
-          <w:szCs w:val="16"/>
-        </w:rPr>
-      </w:pPr>
-      <w:r>
-        <w:rPr>
-          <w:rFonts w:ascii="Arial Narrow" w:hAnsi="Arial Narrow" w:eastAsia="Arial Narrow"/>
-          <w:b/>
-          <w:sz w:val="20"/>
+        <w:spacing w:line="192" w:lineRule="auto"/>
+        <w:jc w:val="both"/>
+        <w:rPr>
+          <w:sz w:val="16"/>
+          <w:szCs w:val="16"/>
+        </w:rPr>
+      </w:pPr>
+      <w:r>
+        <w:rPr>
+          <w:sz w:val="12"/>
           <w:szCs w:val="16"/>
         </w:rPr>
         <w:t>¿Qué pasa si el trabajador no cumple los requisitos para recibir el beneficio?</w:t>
@@ -1706,17 +1663,16 @@
     </w:p>
     <w:p>
       <w:pPr>
-        <w:spacing w:line="240" w:lineRule="auto" w:after="0"/>
-        <w:jc w:val="both"/>
-        <w:rPr>
-          <w:sz w:val="16"/>
-          <w:szCs w:val="16"/>
-        </w:rPr>
-      </w:pPr>
-      <w:r>
-        <w:rPr>
-          <w:rFonts w:ascii="Arial Narrow" w:hAnsi="Arial Narrow" w:eastAsia="Arial Narrow"/>
-          <w:sz w:val="20"/>
+        <w:spacing w:line="192" w:lineRule="auto"/>
+        <w:jc w:val="both"/>
+        <w:rPr>
+          <w:sz w:val="16"/>
+          <w:szCs w:val="16"/>
+        </w:rPr>
+      </w:pPr>
+      <w:r>
+        <w:rPr>
+          <w:sz w:val="12"/>
           <w:szCs w:val="16"/>
         </w:rPr>
         <w:t>Si el trabajador no es elegible para recibir los beneficios del Fondo de Solidaridad</w:t>
@@ -1724,17 +1680,16 @@
     </w:p>
     <w:p>
       <w:pPr>
-        <w:spacing w:line="240" w:lineRule="auto" w:after="0"/>
-        <w:jc w:val="both"/>
-        <w:rPr>
-          <w:sz w:val="16"/>
-          <w:szCs w:val="16"/>
-        </w:rPr>
-      </w:pPr>
-      <w:r>
-        <w:rPr>
-          <w:rFonts w:ascii="Arial Narrow" w:hAnsi="Arial Narrow" w:eastAsia="Arial Narrow"/>
-          <w:sz w:val="20"/>
+        <w:spacing w:line="192" w:lineRule="auto"/>
+        <w:jc w:val="both"/>
+        <w:rPr>
+          <w:sz w:val="16"/>
+          <w:szCs w:val="16"/>
+        </w:rPr>
+      </w:pPr>
+      <w:r>
+        <w:rPr>
+          <w:sz w:val="12"/>
           <w:szCs w:val="16"/>
         </w:rPr>
         <w:t>de Fomento al Empleo y Protección al Cesante, esta decisión contará con el recurso de reposición ante la Caja de Compensación donde presentó la solicitud.</w:t>
@@ -1752,19 +1707,16 @@
     </w:p>
     <w:p>
       <w:pPr>
-        <w:keepNext/>
-        <w:spacing w:line="240" w:lineRule="auto" w:after="0"/>
-        <w:jc w:val="both"/>
-        <w:rPr>
-          <w:sz w:val="16"/>
-          <w:szCs w:val="16"/>
-        </w:rPr>
-      </w:pPr>
-      <w:r>
-        <w:rPr>
-          <w:rFonts w:ascii="Arial Narrow" w:hAnsi="Arial Narrow" w:eastAsia="Arial Narrow"/>
-          <w:b/>
-          <w:sz w:val="20"/>
+        <w:spacing w:line="192" w:lineRule="auto"/>
+        <w:jc w:val="both"/>
+        <w:rPr>
+          <w:sz w:val="16"/>
+          <w:szCs w:val="16"/>
+        </w:rPr>
+      </w:pPr>
+      <w:r>
+        <w:rPr>
+          <w:sz w:val="12"/>
           <w:szCs w:val="16"/>
         </w:rPr>
         <w:t>¿Por cuánto tiempo se otorgan los beneficios del Mecanismo de Protección al Cesante?</w:t>
@@ -1772,17 +1724,16 @@
     </w:p>
     <w:p>
       <w:pPr>
-        <w:spacing w:line="240" w:lineRule="auto" w:after="0"/>
-        <w:jc w:val="both"/>
-        <w:rPr>
-          <w:sz w:val="16"/>
-          <w:szCs w:val="16"/>
-        </w:rPr>
-      </w:pPr>
-      <w:r>
-        <w:rPr>
-          <w:rFonts w:ascii="Arial Narrow" w:hAnsi="Arial Narrow" w:eastAsia="Arial Narrow"/>
-          <w:sz w:val="20"/>
+        <w:spacing w:line="192" w:lineRule="auto"/>
+        <w:jc w:val="both"/>
+        <w:rPr>
+          <w:sz w:val="16"/>
+          <w:szCs w:val="16"/>
+        </w:rPr>
+      </w:pPr>
+      <w:r>
+        <w:rPr>
+          <w:sz w:val="12"/>
           <w:szCs w:val="16"/>
         </w:rPr>
         <w:t>El pago de los beneficios al cesante terminará cuando los beneficios se hayan reconocido por seis meses, cuando el beneficiario establezca nuevamente una relación laboral antes de transcurrir los seis meses o incumpla con las obligaciones contraídas para acceder a los beneficios del Fondo de Solidaridad de Fomento al Empleo y Protección al Cesante. En todo caso, serán incompatibles con toda actividad remunerada y con el pago de cualquier tipo de pensión.</w:t>
@@ -1790,8 +1741,7 @@
     </w:p>
     <w:p>
       <w:pPr>
-        <w:keepNext/>
-        <w:spacing w:line="240" w:lineRule="auto" w:after="0"/>
+        <w:spacing w:line="192" w:lineRule="auto"/>
         <w:jc w:val="both"/>
         <w:rPr>
           <w:sz w:val="16"/>
@@ -1801,9 +1751,7 @@
       <w:proofErr w:type="gramStart"/>
       <w:r>
         <w:rPr>
-          <w:rFonts w:ascii="Arial Narrow" w:hAnsi="Arial Narrow" w:eastAsia="Arial Narrow"/>
-          <w:b/>
-          <w:sz w:val="20"/>
+          <w:sz w:val="12"/>
           <w:szCs w:val="16"/>
         </w:rPr>
         <w:t>Cómo ingreso mi hoja de vida y busco empleo?</w:t>
@@ -1812,17 +1760,16 @@
     </w:p>
     <w:p>
       <w:pPr>
-        <w:spacing w:line="240" w:lineRule="auto" w:after="0"/>
-        <w:jc w:val="both"/>
-        <w:rPr>
-          <w:sz w:val="16"/>
-          <w:szCs w:val="16"/>
-        </w:rPr>
-      </w:pPr>
-      <w:r>
-        <w:rPr>
-          <w:rFonts w:ascii="Arial Narrow" w:hAnsi="Arial Narrow" w:eastAsia="Arial Narrow"/>
-          <w:sz w:val="20"/>
+        <w:spacing w:line="192" w:lineRule="auto"/>
+        <w:jc w:val="both"/>
+        <w:rPr>
+          <w:sz w:val="16"/>
+          <w:szCs w:val="16"/>
+        </w:rPr>
+      </w:pPr>
+      <w:r>
+        <w:rPr>
+          <w:sz w:val="12"/>
           <w:szCs w:val="16"/>
         </w:rPr>
         <w:t>Por medio del siguiente portal: https://agenciapublicadeempleo.sena.edu.co/</w:t>
@@ -1840,19 +1787,16 @@
     </w:p>
     <w:p>
       <w:pPr>
-        <w:keepNext/>
-        <w:spacing w:line="240" w:lineRule="auto" w:after="0"/>
-        <w:jc w:val="both"/>
-        <w:rPr>
-          <w:sz w:val="16"/>
-          <w:szCs w:val="16"/>
-        </w:rPr>
-      </w:pPr>
-      <w:r>
-        <w:rPr>
-          <w:rFonts w:ascii="Arial Narrow" w:hAnsi="Arial Narrow" w:eastAsia="Arial Narrow"/>
-          <w:b/>
-          <w:sz w:val="20"/>
+        <w:spacing w:line="192" w:lineRule="auto"/>
+        <w:jc w:val="both"/>
+        <w:rPr>
+          <w:sz w:val="16"/>
+          <w:szCs w:val="16"/>
+        </w:rPr>
+      </w:pPr>
+      <w:r>
+        <w:rPr>
+          <w:sz w:val="12"/>
           <w:szCs w:val="16"/>
         </w:rPr>
         <w:t>¿Cómo realizo el trámite de Reconocimiento de los Beneficios?</w:t>
@@ -1860,17 +1804,16 @@
     </w:p>
     <w:p>
       <w:pPr>
-        <w:spacing w:line="240" w:lineRule="auto" w:after="0"/>
-        <w:jc w:val="both"/>
-        <w:rPr>
-          <w:sz w:val="16"/>
-          <w:szCs w:val="16"/>
-        </w:rPr>
-      </w:pPr>
-      <w:r>
-        <w:rPr>
-          <w:rFonts w:ascii="Arial Narrow" w:hAnsi="Arial Narrow" w:eastAsia="Arial Narrow"/>
-          <w:sz w:val="20"/>
+        <w:spacing w:line="192" w:lineRule="auto"/>
+        <w:jc w:val="both"/>
+        <w:rPr>
+          <w:sz w:val="16"/>
+          <w:szCs w:val="16"/>
+        </w:rPr>
+      </w:pPr>
+      <w:r>
+        <w:rPr>
+          <w:sz w:val="12"/>
           <w:szCs w:val="16"/>
         </w:rPr>
         <w:t>El trabajador deberá acercarse a solicitar a su Caja de Compensación Familiar el beneficio</w:t>
@@ -1878,17 +1821,16 @@
     </w:p>
     <w:p>
       <w:pPr>
-        <w:spacing w:line="240" w:lineRule="auto" w:after="0"/>
-        <w:jc w:val="both"/>
-        <w:rPr>
-          <w:sz w:val="16"/>
-          <w:szCs w:val="16"/>
-        </w:rPr>
-      </w:pPr>
-      <w:r>
-        <w:rPr>
-          <w:rFonts w:ascii="Arial Narrow" w:hAnsi="Arial Narrow" w:eastAsia="Arial Narrow"/>
-          <w:sz w:val="20"/>
+        <w:spacing w:line="192" w:lineRule="auto"/>
+        <w:jc w:val="both"/>
+        <w:rPr>
+          <w:sz w:val="16"/>
+          <w:szCs w:val="16"/>
+        </w:rPr>
+      </w:pPr>
+      <w:r>
+        <w:rPr>
+          <w:sz w:val="12"/>
           <w:szCs w:val="16"/>
         </w:rPr>
         <w:t xml:space="preserve">El cesante que cumpla con los requisitos, será incluido en el registro para pago de la cotización al Sistema de Seguridad Social en Salud y Pensiones y cuota monetaria de Subsidio Familiar, según corresponda. </w:t>
@@ -1896,8 +1838,7 @@
       <w:proofErr w:type="gramStart"/>
       <w:r>
         <w:rPr>
-          <w:rFonts w:ascii="Arial Narrow" w:hAnsi="Arial Narrow" w:eastAsia="Arial Narrow"/>
-          <w:sz w:val="20"/>
+          <w:sz w:val="12"/>
           <w:szCs w:val="16"/>
         </w:rPr>
         <w:t>Además</w:t>
@@ -1905,8 +1846,7 @@
       <w:proofErr w:type="gramEnd"/>
       <w:r>
         <w:rPr>
-          <w:rFonts w:ascii="Arial Narrow" w:hAnsi="Arial Narrow" w:eastAsia="Arial Narrow"/>
-          <w:sz w:val="20"/>
+          <w:sz w:val="12"/>
           <w:szCs w:val="16"/>
         </w:rPr>
         <w:t xml:space="preserve"> para Iniciar el Proceso de Asesoría de Búsqueda, orientación ocupacional y capacitación.</w:t>
@@ -1924,19 +1864,16 @@
     </w:p>
     <w:p>
       <w:pPr>
-        <w:keepNext/>
-        <w:spacing w:line="240" w:lineRule="auto" w:after="0"/>
-        <w:jc w:val="both"/>
-        <w:rPr>
-          <w:sz w:val="16"/>
-          <w:szCs w:val="16"/>
-        </w:rPr>
-      </w:pPr>
-      <w:r>
-        <w:rPr>
-          <w:rFonts w:ascii="Arial Narrow" w:hAnsi="Arial Narrow" w:eastAsia="Arial Narrow"/>
-          <w:b/>
-          <w:sz w:val="20"/>
+        <w:spacing w:line="192" w:lineRule="auto"/>
+        <w:jc w:val="both"/>
+        <w:rPr>
+          <w:sz w:val="16"/>
+          <w:szCs w:val="16"/>
+        </w:rPr>
+      </w:pPr>
+      <w:r>
+        <w:rPr>
+          <w:sz w:val="12"/>
           <w:szCs w:val="16"/>
         </w:rPr>
         <w:t>¿</w:t>
@@ -1944,9 +1881,7 @@
       <w:proofErr w:type="spellStart"/>
       <w:r>
         <w:rPr>
-          <w:rFonts w:ascii="Arial Narrow" w:hAnsi="Arial Narrow" w:eastAsia="Arial Narrow"/>
-          <w:b/>
-          <w:sz w:val="20"/>
+          <w:sz w:val="12"/>
           <w:szCs w:val="16"/>
         </w:rPr>
         <w:t>Que</w:t>
@@ -1954,9 +1889,7 @@
       <w:proofErr w:type="spellEnd"/>
       <w:r>
         <w:rPr>
-          <w:rFonts w:ascii="Arial Narrow" w:hAnsi="Arial Narrow" w:eastAsia="Arial Narrow"/>
-          <w:b/>
-          <w:sz w:val="20"/>
+          <w:sz w:val="12"/>
           <w:szCs w:val="16"/>
         </w:rPr>
         <w:t xml:space="preserve"> es, y como se pagan los beneficios?</w:t>
@@ -1964,17 +1897,16 @@
     </w:p>
     <w:p>
       <w:pPr>
-        <w:spacing w:line="240" w:lineRule="auto" w:after="0"/>
-        <w:jc w:val="both"/>
-        <w:rPr>
-          <w:sz w:val="16"/>
-          <w:szCs w:val="16"/>
-        </w:rPr>
-      </w:pPr>
-      <w:r>
-        <w:rPr>
-          <w:rFonts w:ascii="Arial Narrow" w:hAnsi="Arial Narrow" w:eastAsia="Arial Narrow"/>
-          <w:sz w:val="20"/>
+        <w:spacing w:line="192" w:lineRule="auto"/>
+        <w:jc w:val="both"/>
+        <w:rPr>
+          <w:sz w:val="16"/>
+          <w:szCs w:val="16"/>
+        </w:rPr>
+      </w:pPr>
+      <w:r>
+        <w:rPr>
+          <w:sz w:val="12"/>
           <w:szCs w:val="16"/>
         </w:rPr>
         <w:t xml:space="preserve">Los trabajadores que cumplan con el requisito de aportes a Cajas de Compensación Familiar recibirán un beneficio, con cargo al </w:t>
@@ -1982,8 +1914,7 @@
       <w:proofErr w:type="spellStart"/>
       <w:r>
         <w:rPr>
-          <w:rFonts w:ascii="Arial Narrow" w:hAnsi="Arial Narrow" w:eastAsia="Arial Narrow"/>
-          <w:sz w:val="20"/>
+          <w:sz w:val="12"/>
           <w:szCs w:val="16"/>
         </w:rPr>
         <w:t>Fosfec</w:t>
@@ -1991,8 +1922,7 @@
       <w:proofErr w:type="spellEnd"/>
       <w:r>
         <w:rPr>
-          <w:rFonts w:ascii="Arial Narrow" w:hAnsi="Arial Narrow" w:eastAsia="Arial Narrow"/>
-          <w:sz w:val="20"/>
+          <w:sz w:val="12"/>
           <w:szCs w:val="16"/>
         </w:rPr>
         <w:t xml:space="preserve">, que consistirá en aportes al Sistema de Salud y Pensiones, calculado sobre un (1) </w:t>
@@ -2000,8 +1930,7 @@
       <w:proofErr w:type="spellStart"/>
       <w:r>
         <w:rPr>
-          <w:rFonts w:ascii="Arial Narrow" w:hAnsi="Arial Narrow" w:eastAsia="Arial Narrow"/>
-          <w:sz w:val="20"/>
+          <w:sz w:val="12"/>
           <w:szCs w:val="16"/>
         </w:rPr>
         <w:t>smmlv</w:t>
@@ -2009,8 +1938,7 @@
       <w:proofErr w:type="spellEnd"/>
       <w:r>
         <w:rPr>
-          <w:rFonts w:ascii="Arial Narrow" w:hAnsi="Arial Narrow" w:eastAsia="Arial Narrow"/>
-          <w:sz w:val="20"/>
+          <w:sz w:val="12"/>
           <w:szCs w:val="16"/>
         </w:rPr>
         <w:t>. También tendrá acceso a la cuota monetaria del subsidio familiar en las condiciones establecidas en la legislación vigente de acuerdo con lo que reglamente el Gobierno Nacional.</w:t>
@@ -2028,19 +1956,16 @@
     </w:p>
     <w:p>
       <w:pPr>
-        <w:keepNext/>
-        <w:spacing w:line="240" w:lineRule="auto" w:after="0"/>
-        <w:jc w:val="both"/>
-        <w:rPr>
-          <w:sz w:val="16"/>
-          <w:szCs w:val="16"/>
-        </w:rPr>
-      </w:pPr>
-      <w:r>
-        <w:rPr>
-          <w:rFonts w:ascii="Arial Narrow" w:hAnsi="Arial Narrow" w:eastAsia="Arial Narrow"/>
-          <w:b/>
-          <w:sz w:val="20"/>
+        <w:spacing w:line="192" w:lineRule="auto"/>
+        <w:jc w:val="both"/>
+        <w:rPr>
+          <w:sz w:val="16"/>
+          <w:szCs w:val="16"/>
+        </w:rPr>
+      </w:pPr>
+      <w:r>
+        <w:rPr>
+          <w:sz w:val="12"/>
           <w:szCs w:val="16"/>
         </w:rPr>
         <w:t>¿</w:t>
@@ -2048,9 +1973,7 @@
       <w:proofErr w:type="spellStart"/>
       <w:r>
         <w:rPr>
-          <w:rFonts w:ascii="Arial Narrow" w:hAnsi="Arial Narrow" w:eastAsia="Arial Narrow"/>
-          <w:b/>
-          <w:sz w:val="20"/>
+          <w:sz w:val="12"/>
           <w:szCs w:val="16"/>
         </w:rPr>
         <w:t>Que</w:t>
@@ -2058,9 +1981,7 @@
       <w:proofErr w:type="spellEnd"/>
       <w:r>
         <w:rPr>
-          <w:rFonts w:ascii="Arial Narrow" w:hAnsi="Arial Narrow" w:eastAsia="Arial Narrow"/>
-          <w:b/>
-          <w:sz w:val="20"/>
+          <w:sz w:val="12"/>
           <w:szCs w:val="16"/>
         </w:rPr>
         <w:t xml:space="preserve"> es la Capacitación para inserción laboral?</w:t>
@@ -2068,17 +1989,16 @@
     </w:p>
     <w:p>
       <w:pPr>
-        <w:spacing w:line="240" w:lineRule="auto" w:after="0"/>
-        <w:jc w:val="both"/>
-        <w:rPr>
-          <w:sz w:val="16"/>
-          <w:szCs w:val="16"/>
-        </w:rPr>
-      </w:pPr>
-      <w:r>
-        <w:rPr>
-          <w:rFonts w:ascii="Arial Narrow" w:hAnsi="Arial Narrow" w:eastAsia="Arial Narrow"/>
-          <w:sz w:val="20"/>
+        <w:spacing w:line="192" w:lineRule="auto"/>
+        <w:jc w:val="both"/>
+        <w:rPr>
+          <w:sz w:val="16"/>
+          <w:szCs w:val="16"/>
+        </w:rPr>
+      </w:pPr>
+      <w:r>
+        <w:rPr>
+          <w:sz w:val="12"/>
           <w:szCs w:val="16"/>
         </w:rPr>
         <w:t>El aprendizaje se basa en la práctica y habilita al aprendiz para el desempeño de una ocupación, su diseño es modular y basado en competencias laborales. Estas capacitaciones son entregadas gratuitamente.</w:t>
@@ -2096,8 +2016,7 @@
     </w:p>
     <w:p>
       <w:pPr>
-        <w:keepNext/>
-        <w:spacing w:line="240" w:lineRule="auto" w:after="0"/>
+        <w:spacing w:line="192" w:lineRule="auto"/>
         <w:jc w:val="both"/>
         <w:rPr>
           <w:sz w:val="16"/>
@@ -2107,9 +2026,7 @@
       <w:proofErr w:type="gramStart"/>
       <w:r>
         <w:rPr>
-          <w:rFonts w:ascii="Arial Narrow" w:hAnsi="Arial Narrow" w:eastAsia="Arial Narrow"/>
-          <w:b/>
-          <w:sz w:val="20"/>
+          <w:sz w:val="12"/>
           <w:szCs w:val="16"/>
         </w:rPr>
         <w:t xml:space="preserve">En conclusión, </w:t>
@@ -2117,9 +2034,7 @@
       <w:proofErr w:type="spellStart"/>
       <w:r>
         <w:rPr>
-          <w:rFonts w:ascii="Arial Narrow" w:hAnsi="Arial Narrow" w:eastAsia="Arial Narrow"/>
-          <w:b/>
-          <w:sz w:val="20"/>
+          <w:sz w:val="12"/>
           <w:szCs w:val="16"/>
         </w:rPr>
         <w:t>cuales</w:t>
@@ -2127,9 +2042,7 @@
       <w:proofErr w:type="spellEnd"/>
       <w:r>
         <w:rPr>
-          <w:rFonts w:ascii="Arial Narrow" w:hAnsi="Arial Narrow" w:eastAsia="Arial Narrow"/>
-          <w:b/>
-          <w:sz w:val="20"/>
+          <w:sz w:val="12"/>
           <w:szCs w:val="16"/>
         </w:rPr>
         <w:t xml:space="preserve"> son los beneficios?</w:t>
@@ -2138,17 +2051,16 @@
     </w:p>
     <w:p>
       <w:pPr>
-        <w:spacing w:line="240" w:lineRule="auto" w:after="0"/>
-        <w:jc w:val="both"/>
-        <w:rPr>
-          <w:sz w:val="16"/>
-          <w:szCs w:val="16"/>
-        </w:rPr>
-      </w:pPr>
-      <w:r>
-        <w:rPr>
-          <w:rFonts w:ascii="Arial Narrow" w:hAnsi="Arial Narrow" w:eastAsia="Arial Narrow"/>
-          <w:sz w:val="20"/>
+        <w:spacing w:line="192" w:lineRule="auto"/>
+        <w:jc w:val="both"/>
+        <w:rPr>
+          <w:sz w:val="16"/>
+          <w:szCs w:val="16"/>
+        </w:rPr>
+      </w:pPr>
+      <w:r>
+        <w:rPr>
+          <w:sz w:val="12"/>
           <w:szCs w:val="16"/>
         </w:rPr>
         <w:t>Una vez verificados los requisitos de que trata el artículo 13 de la Ley 1636 de 2013, deberán seguirse las siguientes reglas para el pago de los aportes de Seguridad Social en Salud y Pensiones y de cuota monetaria por cesante:</w:t>
@@ -2166,17 +2078,16 @@
     </w:p>
     <w:p>
       <w:pPr>
-        <w:spacing w:line="240" w:lineRule="auto" w:after="0"/>
-        <w:jc w:val="both"/>
-        <w:rPr>
-          <w:sz w:val="16"/>
-          <w:szCs w:val="16"/>
-        </w:rPr>
-      </w:pPr>
-      <w:r>
-        <w:rPr>
-          <w:rFonts w:ascii="Arial Narrow" w:hAnsi="Arial Narrow" w:eastAsia="Arial Narrow"/>
-          <w:sz w:val="20"/>
+        <w:spacing w:line="192" w:lineRule="auto"/>
+        <w:jc w:val="both"/>
+        <w:rPr>
+          <w:sz w:val="16"/>
+          <w:szCs w:val="16"/>
+        </w:rPr>
+      </w:pPr>
+      <w:r>
+        <w:rPr>
+          <w:sz w:val="12"/>
           <w:szCs w:val="16"/>
         </w:rPr>
         <w:t>1. La Caja de Compensación Familiar reportará al día siguiente de la inscripción en el Registro de Beneficiarios la novedad de afiliación o reactivación del cesante a los sistemas de salud y pensiones. El pago de las cotizaciones a los sistemas de pensiones y salud deberá realizarse por la Caja de Compensación Familiar. Este pago se realizará mes a mes hasta por seis (6) meses</w:t>
@@ -2184,17 +2095,16 @@
     </w:p>
     <w:p>
       <w:pPr>
-        <w:spacing w:line="240" w:lineRule="auto" w:after="0"/>
-        <w:jc w:val="both"/>
-        <w:rPr>
-          <w:sz w:val="16"/>
-          <w:szCs w:val="16"/>
-        </w:rPr>
-      </w:pPr>
-      <w:r>
-        <w:rPr>
-          <w:rFonts w:ascii="Arial Narrow" w:hAnsi="Arial Narrow" w:eastAsia="Arial Narrow"/>
-          <w:sz w:val="20"/>
+        <w:spacing w:line="192" w:lineRule="auto"/>
+        <w:jc w:val="both"/>
+        <w:rPr>
+          <w:sz w:val="16"/>
+          <w:szCs w:val="16"/>
+        </w:rPr>
+      </w:pPr>
+      <w:r>
+        <w:rPr>
+          <w:sz w:val="12"/>
           <w:szCs w:val="16"/>
         </w:rPr>
         <w:t>2. Los cesantes beneficiarios de las prestaciones económicas que durante su última vinculación como dependientes estaban gozando de cuota monetaria de subsidio familiar, continuarán recibiéndola en las mismas condiciones y por igual número de personas a cargo, a partir del mes en que se paguen las cotizaciones a los sistemas de pensiones y salud.</w:t>
@@ -2202,17 +2112,16 @@
     </w:p>
     <w:p>
       <w:pPr>
-        <w:spacing w:line="240" w:lineRule="auto" w:after="0"/>
-        <w:jc w:val="both"/>
-        <w:rPr>
-          <w:sz w:val="16"/>
-          <w:szCs w:val="16"/>
-        </w:rPr>
-      </w:pPr>
-      <w:r>
-        <w:rPr>
-          <w:rFonts w:ascii="Arial Narrow" w:hAnsi="Arial Narrow" w:eastAsia="Arial Narrow"/>
-          <w:sz w:val="20"/>
+        <w:spacing w:line="192" w:lineRule="auto"/>
+        <w:jc w:val="both"/>
+        <w:rPr>
+          <w:sz w:val="16"/>
+          <w:szCs w:val="16"/>
+        </w:rPr>
+      </w:pPr>
+      <w:r>
+        <w:rPr>
+          <w:sz w:val="12"/>
           <w:szCs w:val="16"/>
         </w:rPr>
         <w:t>3. Si un trabajador, además de realizar aportes a las Cajas de Compensación Familiar, voluntariamente hubiera ahorrado en el mecanismo de protección al cesante, recibirá como beneficio monetario un valor proporcional al monto del ahorro alcanzado.</w:t>
@@ -2220,17 +2129,16 @@
     </w:p>
     <w:p>
       <w:pPr>
-        <w:spacing w:line="240" w:lineRule="auto" w:after="0"/>
-        <w:jc w:val="both"/>
-        <w:rPr>
-          <w:sz w:val="16"/>
-          <w:szCs w:val="16"/>
-        </w:rPr>
-      </w:pPr>
-      <w:r>
-        <w:rPr>
-          <w:rFonts w:ascii="Arial Narrow" w:hAnsi="Arial Narrow" w:eastAsia="Arial Narrow"/>
-          <w:sz w:val="20"/>
+        <w:spacing w:line="192" w:lineRule="auto"/>
+        <w:jc w:val="both"/>
+        <w:rPr>
+          <w:sz w:val="16"/>
+          <w:szCs w:val="16"/>
+        </w:rPr>
+      </w:pPr>
+      <w:r>
+        <w:rPr>
+          <w:sz w:val="12"/>
           <w:szCs w:val="16"/>
         </w:rPr>
         <w:t>4. Acceso a los portales de búsqueda de empleo y mayor posibilidad de ser elegido en los procesos de búsqueda en empresas</w:t>
@@ -2238,17 +2146,16 @@
     </w:p>
     <w:p>
       <w:pPr>
-        <w:spacing w:line="240" w:lineRule="auto" w:after="0"/>
-        <w:jc w:val="both"/>
-        <w:rPr>
-          <w:sz w:val="16"/>
-          <w:szCs w:val="16"/>
-        </w:rPr>
-      </w:pPr>
-      <w:r>
-        <w:rPr>
-          <w:rFonts w:ascii="Arial Narrow" w:hAnsi="Arial Narrow" w:eastAsia="Arial Narrow"/>
-          <w:sz w:val="20"/>
+        <w:spacing w:line="192" w:lineRule="auto"/>
+        <w:jc w:val="both"/>
+        <w:rPr>
+          <w:sz w:val="16"/>
+          <w:szCs w:val="16"/>
+        </w:rPr>
+      </w:pPr>
+      <w:r>
+        <w:rPr>
+          <w:sz w:val="12"/>
           <w:szCs w:val="16"/>
         </w:rPr>
         <w:t>5. Capacitación para inserción laboral</w:t>
@@ -2266,17 +2173,16 @@
     </w:p>
     <w:p>
       <w:pPr>
-        <w:spacing w:line="240" w:lineRule="auto" w:after="0"/>
-        <w:jc w:val="both"/>
-        <w:rPr>
-          <w:sz w:val="16"/>
-          <w:szCs w:val="16"/>
-        </w:rPr>
-      </w:pPr>
-      <w:r>
-        <w:rPr>
-          <w:rFonts w:ascii="Arial Narrow" w:hAnsi="Arial Narrow" w:eastAsia="Arial Narrow"/>
-          <w:sz w:val="20"/>
+        <w:spacing w:line="192" w:lineRule="auto"/>
+        <w:jc w:val="both"/>
+        <w:rPr>
+          <w:sz w:val="16"/>
+          <w:szCs w:val="16"/>
+        </w:rPr>
+      </w:pPr>
+      <w:r>
+        <w:rPr>
+          <w:sz w:val="12"/>
           <w:szCs w:val="16"/>
         </w:rPr>
         <w:t>Este documento tiene como finalidad orientar el acceso a beneficios establecidos para cesantes de manera general conforme a la información pública y disponible de Cajas de Compensación y Ministerio del Trabajo, para mayor información y detalle puede acudir a su Caja de Compensación.</w:t>
@@ -2294,17 +2200,16 @@
     </w:p>
     <w:p>
       <w:pPr>
-        <w:spacing w:line="240" w:lineRule="auto" w:after="0"/>
-        <w:jc w:val="both"/>
-        <w:rPr>
-          <w:sz w:val="16"/>
-          <w:szCs w:val="16"/>
-        </w:rPr>
-      </w:pPr>
-      <w:r>
-        <w:rPr>
-          <w:rFonts w:ascii="Arial Narrow" w:hAnsi="Arial Narrow" w:eastAsia="Arial Narrow"/>
-          <w:sz w:val="20"/>
+        <w:spacing w:line="192" w:lineRule="auto"/>
+        <w:jc w:val="both"/>
+        <w:rPr>
+          <w:sz w:val="16"/>
+          <w:szCs w:val="16"/>
+        </w:rPr>
+      </w:pPr>
+      <w:r>
+        <w:rPr>
+          <w:sz w:val="12"/>
           <w:szCs w:val="16"/>
         </w:rPr>
         <w:t>Es importante mencionar que Aseos La Perfección entregará los documentos de importancia tales como cartas de retiro de cesantías, reportes de pago al sistema de seguridad social, certificaciones laborales y demás que requiera el ex trabajador para acceder a tales beneficios y la consecución de un nuevo empleo.</w:t>
@@ -2322,17 +2227,16 @@
     </w:p>
     <w:p>
       <w:pPr>
-        <w:spacing w:line="240" w:lineRule="auto" w:after="0"/>
-        <w:jc w:val="both"/>
-        <w:rPr>
-          <w:sz w:val="16"/>
-          <w:szCs w:val="16"/>
-        </w:rPr>
-      </w:pPr>
-      <w:r>
-        <w:rPr>
-          <w:rFonts w:ascii="Arial Narrow" w:hAnsi="Arial Narrow" w:eastAsia="Arial Narrow"/>
-          <w:sz w:val="20"/>
+        <w:spacing w:line="192" w:lineRule="auto"/>
+        <w:jc w:val="both"/>
+        <w:rPr>
+          <w:sz w:val="16"/>
+          <w:szCs w:val="16"/>
+        </w:rPr>
+      </w:pPr>
+      <w:r>
+        <w:rPr>
+          <w:sz w:val="12"/>
           <w:szCs w:val="16"/>
         </w:rPr>
         <w:t>Este documento se circulará en forma física o de manera electrónica, los cambios en su contenido están supeditados a las reglamentaciones que sobre el particular se expidan por el Gobierno Nacional</w:t>
@@ -2442,8 +2346,7 @@
     </w:p>
     <w:p>
       <w:pPr>
-        <w:keepLines/>
-        <w:spacing w:line="240" w:lineRule="auto" w:after="0"/>
+        <w:spacing w:line="192" w:lineRule="auto"/>
         <w:jc w:val="right"/>
         <w:rPr>
           <w:rFonts w:ascii="Arial Narrow" w:hAnsi="Arial Narrow"/>
@@ -2454,7 +2357,7 @@
       <w:r>
         <w:rPr>
           <w:rFonts w:ascii="Arial Narrow" w:hAnsi="Arial Narrow"/>
-          <w:sz w:val="20"/>
+          <w:sz w:val="12"/>
           <w:szCs w:val="20"/>
         </w:rPr>
         <w:t>RECIBIDO: ____________________________________________</w:t>
@@ -2484,8 +2387,7 @@
     </w:p>
     <w:p>
       <w:pPr>
-        <w:keepLines/>
-        <w:spacing w:line="240" w:lineRule="auto" w:after="0"/>
+        <w:spacing w:line="192" w:lineRule="auto"/>
         <w:jc w:val="center"/>
         <w:rPr>
           <w:rFonts w:ascii="Arial Narrow" w:hAnsi="Arial Narrow"/>
@@ -2504,7 +2406,7 @@
       <w:r>
         <w:rPr>
           <w:rFonts w:ascii="Arial Narrow" w:hAnsi="Arial Narrow"/>
-          <w:sz w:val="20"/>
+          <w:sz w:val="12"/>
           <w:szCs w:val="20"/>
         </w:rPr>
         <w:t>FECHA:</w:t>
@@ -2520,7 +2422,7 @@
       <w:r>
         <w:rPr>
           <w:rFonts w:ascii="Arial Narrow" w:hAnsi="Arial Narrow"/>
-          <w:sz w:val="20"/>
+          <w:sz w:val="12"/>
           <w:szCs w:val="20"/>
         </w:rPr>
         <w:t>{{FECHA_HOY}}</w:t>

</xml_diff>